<commit_message>
Academic CV: fill degrees (MBA FIU 2011, BSc LSE 2005, Columbia FinTech), certifications, examiner record, contact from master resume; flag GPA figure for transcript verification
Co-Authored-By: Claude Fable 5 <noreply@anthropic.com>
Claude-Session: https://claude.ai/code/session_019uQWfMoV11me5yJ6LYRtPv
</commit_message>
<xml_diff>
--- a/career/ACADEMIC_CV_YMalik.docx
+++ b/career/ACADEMIC_CV_YMalik.docx
@@ -20,7 +20,7 @@
     </w:p>
     <w:p>
       <w:r>
-        <w:t>NYC Metro / Newark NJ · ymali001@fiu.edu · [LinkedIn: CONFIRM URL] · [Phone: CONFIRM]</w:t>
+        <w:t>Newark, NJ · ymali001@fiu.edu · linkedin.com/in/yasiramalik · +1 (305) 799-2443</w:t>
       </w:r>
     </w:p>
     <w:p>
@@ -71,7 +71,7 @@
     </w:p>
     <w:p>
       <w:r>
-        <w:t>In progress; entered Spring 2024 · GPA 3.81 · Qualifying research project completed July 2026</w:t>
+        <w:t>In progress, expected 2027 · GPA 3.81–3.87 [CONFIRM against current transcript — resume states 3.87, the 2024–25 official evaluation recorded 3.81] · Qualifying research project completed July 2026</w:t>
       </w:r>
     </w:p>
     <w:p>
@@ -90,7 +90,10 @@
         <w:rPr>
           <w:b/>
         </w:rPr>
-        <w:t>[CONFIRM: Master's degree — institution, field, year]</w:t>
+        <w:t>Master of Business Administration (MBA)</w:t>
+      </w:r>
+      <w:r>
+        <w:t xml:space="preserve"> — Florida International University, 2011 · GPA 3.8</w:t>
       </w:r>
     </w:p>
     <w:p>
@@ -98,7 +101,21 @@
         <w:rPr>
           <w:b/>
         </w:rPr>
-        <w:t>[CONFIRM: Bachelor's degree — institution, field, year]</w:t>
+        <w:t>B.Sc., Banking &amp; Finance</w:t>
+      </w:r>
+      <w:r>
+        <w:t xml:space="preserve"> — London School of Economics (LSE), 2005</w:t>
+      </w:r>
+    </w:p>
+    <w:p>
+      <w:r>
+        <w:rPr>
+          <w:b/>
+        </w:rPr>
+        <w:t>Columbia Engineering FinTech Boot Camp</w:t>
+      </w:r>
+      <w:r>
+        <w:t xml:space="preserve"> — Columbia University, 2021 (ML, Python, algorithmic trading)</w:t>
       </w:r>
     </w:p>
     <w:p>
@@ -264,16 +281,10 @@
         <w:rPr>
           <w:b/>
         </w:rPr>
-        <w:t>Bank Examiner — OCC, Federal Reserve, FDIC</w:t>
+        <w:t>Bank Examiner — OCC / Florida Office of Financial Regulation</w:t>
       </w:r>
       <w:r>
-        <w:t xml:space="preserve"> </w:t>
-      </w:r>
-      <w:r>
-        <w:rPr>
-          <w:i/>
-        </w:rPr>
-        <w:t>[CONFIRM years/agency order]</w:t>
+        <w:t xml:space="preserve"> (2011–2012)</w:t>
       </w:r>
     </w:p>
     <w:p>
@@ -291,10 +302,7 @@
     </w:p>
     <w:p>
       <w:r>
-        <w:rPr>
-          <w:b/>
-        </w:rPr>
-        <w:t>[CONFIRM: e.g., CPA / CIA / CISA / CFE — list only what is current]</w:t>
+        <w:t>FDIC Bank Examiner I · Registered Scrum Master · GCP Social/Behavioral Human Research (AI Ethics)</w:t>
       </w:r>
     </w:p>
     <w:p>

</xml_diff>